<commit_message>
fix(kt02): add public website functional testing techniques
Co-authored-by: Cursor <cursoragent@cursor.com>
</commit_message>
<xml_diff>
--- a/reports/KT02.docx
+++ b/reports/KT02.docx
@@ -14,74 +14,6 @@
           <w:sz w:val="24"/>
         </w:rPr>
         <w:t>Дисциплина: Модульное тестирование веб-приложений</w:t>
-      </w:r>
-    </w:p>
-    <w:p>
-      <w:pPr>
-        <w:spacing w:after="120" w:line="276" w:lineRule="auto"/>
-        <w:jc w:val="center"/>
-      </w:pPr>
-      <w:r>
-        <w:rPr>
-          <w:rFonts w:ascii="Times New Roman" w:hAnsi="Times New Roman" w:eastAsia="Times New Roman"/>
-          <w:b w:val="0"/>
-          <w:sz w:val="24"/>
-        </w:rPr>
-        <w:t>Учебное заведение: ______________________________</w:t>
-      </w:r>
-    </w:p>
-    <w:p>
-      <w:pPr>
-        <w:spacing w:after="120" w:line="276" w:lineRule="auto"/>
-        <w:jc w:val="center"/>
-      </w:pPr>
-      <w:r>
-        <w:rPr>
-          <w:rFonts w:ascii="Times New Roman" w:hAnsi="Times New Roman" w:eastAsia="Times New Roman"/>
-          <w:b w:val="0"/>
-          <w:sz w:val="24"/>
-        </w:rPr>
-        <w:t>Студент: _______________________________________</w:t>
-      </w:r>
-    </w:p>
-    <w:p>
-      <w:pPr>
-        <w:spacing w:after="120" w:line="276" w:lineRule="auto"/>
-        <w:jc w:val="center"/>
-      </w:pPr>
-      <w:r>
-        <w:rPr>
-          <w:rFonts w:ascii="Times New Roman" w:hAnsi="Times New Roman" w:eastAsia="Times New Roman"/>
-          <w:b w:val="0"/>
-          <w:sz w:val="24"/>
-        </w:rPr>
-        <w:t>Преподаватель: _________________________________</w:t>
-      </w:r>
-    </w:p>
-    <w:p>
-      <w:pPr>
-        <w:spacing w:after="120" w:line="276" w:lineRule="auto"/>
-        <w:jc w:val="center"/>
-      </w:pPr>
-      <w:r>
-        <w:rPr>
-          <w:rFonts w:ascii="Times New Roman" w:hAnsi="Times New Roman" w:eastAsia="Times New Roman"/>
-          <w:b w:val="0"/>
-          <w:sz w:val="24"/>
-        </w:rPr>
-        <w:t>Группа: ________________________________________</w:t>
-      </w:r>
-    </w:p>
-    <w:p>
-      <w:pPr>
-        <w:spacing w:after="120" w:line="276" w:lineRule="auto"/>
-      </w:pPr>
-      <w:r>
-        <w:rPr>
-          <w:rFonts w:ascii="Times New Roman" w:hAnsi="Times New Roman" w:eastAsia="Times New Roman"/>
-          <w:b w:val="0"/>
-          <w:sz w:val="24"/>
-        </w:rPr>
       </w:r>
     </w:p>
     <w:p>
@@ -109,21 +41,7 @@
           <w:b w:val="0"/>
           <w:sz w:val="24"/>
         </w:rPr>
-        <w:t>Отчёт по контрольной точке</w:t>
-      </w:r>
-    </w:p>
-    <w:p>
-      <w:pPr>
-        <w:spacing w:after="120" w:line="276" w:lineRule="auto"/>
-        <w:jc w:val="center"/>
-      </w:pPr>
-      <w:r>
-        <w:rPr>
-          <w:rFonts w:ascii="Times New Roman" w:hAnsi="Times New Roman" w:eastAsia="Times New Roman"/>
-          <w:b w:val="0"/>
-          <w:sz w:val="24"/>
-        </w:rPr>
-        <w:t>Дата выполнения: 2026-10-09</w:t>
+        <w:t>Отчёт по контрольной точке (включая remediation 2026-10-10)</w:t>
       </w:r>
     </w:p>
     <w:p>
@@ -149,7 +67,7 @@
           <w:b w:val="0"/>
           <w:sz w:val="24"/>
         </w:rPr>
-        <w:t>Цель контрольной точки №2 — освоить техники тестирования веб-приложения с помощью Selenium WebDriver: работу с несколькими окнами/вкладками (window handles) и взаимодействие с содержимым iframe, включая возврат в основной документ методом default_content().</w:t>
+        <w:t>Освоить техники функционального тестирования веб-приложения в Selenium: позитивные/негативные/граничные сценарии, разнообразие локаторов, cookies, window handles; а также исторический слой — окна/вкладки и iframe.</w:t>
       </w:r>
     </w:p>
     <w:p>
@@ -162,7 +80,7 @@
           <w:b/>
           <w:sz w:val="28"/>
         </w:rPr>
-        <w:t>2. Требования задания</w:t>
+        <w:t>2. Объект тестирования</w:t>
       </w:r>
     </w:p>
     <w:p>
@@ -175,7 +93,7 @@
           <w:b w:val="0"/>
           <w:sz w:val="24"/>
         </w:rPr>
-        <w:t>Согласно постановке КТ 02 (10 баллов) и уточнённым требованиям:</w:t>
+        <w:t>• Публичный сайт remediation: https://www.saucedemo.com/</w:t>
       </w:r>
     </w:p>
     <w:p>
@@ -188,7 +106,20 @@
           <w:b w:val="0"/>
           <w:sz w:val="24"/>
         </w:rPr>
-        <w:t>• открыть новое окно/вкладку браузера;</w:t>
+        <w:t>• Исторический слой: локальные HTML-фикстуры selenium/fixtures/kt02/ (окна + iframe)</w:t>
+      </w:r>
+    </w:p>
+    <w:p>
+      <w:pPr>
+        <w:pStyle w:val="Heading1"/>
+      </w:pPr>
+      <w:r>
+        <w:rPr>
+          <w:rFonts w:ascii="Times New Roman" w:hAnsi="Times New Roman" w:eastAsia="Times New Roman"/>
+          <w:b/>
+          <w:sz w:val="28"/>
+        </w:rPr>
+        <w:t>3. Среда</w:t>
       </w:r>
     </w:p>
     <w:p>
@@ -201,7 +132,7 @@
           <w:b w:val="0"/>
           <w:sz w:val="24"/>
         </w:rPr>
-        <w:t>• переключиться на новое окно через window handles;</w:t>
+        <w:t>• ОС: Windows 10; Python 3.13.2; pytest 8.4.2; Selenium 4.50; Chrome</w:t>
       </w:r>
     </w:p>
     <w:p>
@@ -214,7 +145,7 @@
           <w:b w:val="0"/>
           <w:sz w:val="24"/>
         </w:rPr>
-        <w:t>• проверить содержимое нового окна;</w:t>
+        <w:t>• Page Object: selenium/pages/sauce/</w:t>
       </w:r>
     </w:p>
     <w:p>
@@ -227,7 +158,98 @@
           <w:b w:val="0"/>
           <w:sz w:val="24"/>
         </w:rPr>
-        <w:t>• закрыть вторичное окно и вернуться в исходное;</w:t>
+        <w:t>• Явные ожидания WebDriverWait / EC.*</w:t>
+      </w:r>
+    </w:p>
+    <w:p>
+      <w:pPr>
+        <w:pStyle w:val="Heading1"/>
+      </w:pPr>
+      <w:r>
+        <w:rPr>
+          <w:rFonts w:ascii="Times New Roman" w:hAnsi="Times New Roman" w:eastAsia="Times New Roman"/>
+          <w:b/>
+          <w:sz w:val="28"/>
+        </w:rPr>
+        <w:t>4. Команды запуска</w:t>
+      </w:r>
+    </w:p>
+    <w:p>
+      <w:pPr>
+        <w:spacing w:after="0" w:before="0" w:line="240" w:lineRule="auto"/>
+      </w:pPr>
+      <w:r>
+        <w:rPr>
+          <w:rFonts w:ascii="Consolas" w:hAnsi="Consolas" w:eastAsia="Consolas"/>
+          <w:b w:val="0"/>
+          <w:sz w:val="18"/>
+        </w:rPr>
+        <w:t># Публичный Sauce Demo (remediation)</w:t>
+      </w:r>
+    </w:p>
+    <w:p>
+      <w:pPr>
+        <w:spacing w:after="0" w:before="0" w:line="240" w:lineRule="auto"/>
+      </w:pPr>
+      <w:r>
+        <w:rPr>
+          <w:rFonts w:ascii="Consolas" w:hAnsi="Consolas" w:eastAsia="Consolas"/>
+          <w:b w:val="0"/>
+          <w:sz w:val="18"/>
+        </w:rPr>
+        <w:t>.\.venv\Scripts\python.exe -m pytest selenium\tests\test_kt02_sauce_public.py -v --browser=chrome --page-load-strategy=eager</w:t>
+      </w:r>
+    </w:p>
+    <w:p>
+      <w:pPr>
+        <w:spacing w:after="0" w:before="0" w:line="240" w:lineRule="auto"/>
+      </w:pPr>
+      <w:r>
+        <w:rPr>
+          <w:rFonts w:ascii="Consolas" w:hAnsi="Consolas" w:eastAsia="Consolas"/>
+          <w:b w:val="0"/>
+          <w:sz w:val="18"/>
+        </w:rPr>
+        <w:t xml:space="preserve"> </w:t>
+      </w:r>
+    </w:p>
+    <w:p>
+      <w:pPr>
+        <w:spacing w:after="0" w:before="0" w:line="240" w:lineRule="auto"/>
+      </w:pPr>
+      <w:r>
+        <w:rPr>
+          <w:rFonts w:ascii="Consolas" w:hAnsi="Consolas" w:eastAsia="Consolas"/>
+          <w:b w:val="0"/>
+          <w:sz w:val="18"/>
+        </w:rPr>
+        <w:t># Исторические окна/iframe</w:t>
+      </w:r>
+    </w:p>
+    <w:p>
+      <w:pPr>
+        <w:spacing w:after="0" w:before="0" w:line="240" w:lineRule="auto"/>
+      </w:pPr>
+      <w:r>
+        <w:rPr>
+          <w:rFonts w:ascii="Consolas" w:hAnsi="Consolas" w:eastAsia="Consolas"/>
+          <w:b w:val="0"/>
+          <w:sz w:val="18"/>
+        </w:rPr>
+        <w:t>.\.venv\Scripts\python.exe -m pytest selenium\tests\test_kt02_windows.py selenium\tests\test_kt02_iframe.py -v --browser=chrome</w:t>
+      </w:r>
+    </w:p>
+    <w:p>
+      <w:pPr>
+        <w:pStyle w:val="Heading1"/>
+      </w:pPr>
+      <w:r>
+        <w:rPr>
+          <w:rFonts w:ascii="Times New Roman" w:hAnsi="Times New Roman" w:eastAsia="Times New Roman"/>
+          <w:b/>
+          <w:sz w:val="28"/>
+        </w:rPr>
+        <w:t>5. Тест-кейсы remediation (публичный сайт)</w:t>
       </w:r>
     </w:p>
     <w:p>
@@ -240,7 +262,7 @@
           <w:b w:val="0"/>
           <w:sz w:val="24"/>
         </w:rPr>
-        <w:t>• переключиться в iframe, выполнить действие и проверить результат;</w:t>
+        <w:t>TC02-P01…P03 — positive: login, product/cart, remove+checkout.</w:t>
       </w:r>
     </w:p>
     <w:p>
@@ -253,7 +275,7 @@
           <w:b w:val="0"/>
           <w:sz w:val="24"/>
         </w:rPr>
-        <w:t>• вернуться в основной документ через default_content();</w:t>
+        <w:t>TC02-N01…N04 — negative: empty user/password, bad credentials, checkout required.</w:t>
       </w:r>
     </w:p>
     <w:p>
@@ -266,7 +288,7 @@
           <w:b w:val="0"/>
           <w:sz w:val="24"/>
         </w:rPr>
-        <w:t>• использовать осмысленные assertions и явные ожидания WebDriverWait;</w:t>
+        <w:t>TC02-B01 — boundary: postal code empty vs minimal «1».</w:t>
       </w:r>
     </w:p>
     <w:p>
@@ -279,7 +301,7 @@
           <w:b w:val="0"/>
           <w:sz w:val="24"/>
         </w:rPr>
-        <w:t>• сохранить инфраструктуру КТ 01 без поломки регрессии.</w:t>
+        <w:t>TC02-T01…T03 — locators (ID/CSS/Name/XPath), cookies, window handles.</w:t>
       </w:r>
     </w:p>
     <w:p>
@@ -292,7 +314,7 @@
           <w:b/>
           <w:sz w:val="28"/>
         </w:rPr>
-        <w:t>3. Выбор тестового приложения</w:t>
+        <w:t>6. Фактические результаты</w:t>
       </w:r>
     </w:p>
     <w:p>
@@ -305,20 +327,202 @@
           <w:b w:val="0"/>
           <w:sz w:val="24"/>
         </w:rPr>
-        <w:t>Публичный демонстрационный сайт https://the-internet.herokuapp.com был проверен перед реализацией: страницы /windows и /iframe отвечали HTTP 200. Для стабильных локаторов и воспроизводимости без зависимости от внешнего TinyMCE-редактора подготовлены локальные HTML-фикстуры в selenium/fixtures/kt02/ (аналог учебных страниц the-internet: отдельное окно и вложенный iframe с формой).</w:t>
+        <w:t>Публичный прогон (2026-10-10):</w:t>
       </w:r>
     </w:p>
     <w:p>
       <w:pPr>
-        <w:pStyle w:val="Heading1"/>
+        <w:spacing w:after="0" w:before="0" w:line="240" w:lineRule="auto"/>
       </w:pPr>
       <w:r>
         <w:rPr>
-          <w:rFonts w:ascii="Times New Roman" w:hAnsi="Times New Roman" w:eastAsia="Times New Roman"/>
-          <w:b/>
-          <w:sz w:val="28"/>
+          <w:rFonts w:ascii="Consolas" w:hAnsi="Consolas" w:eastAsia="Consolas"/>
+          <w:b w:val="0"/>
+          <w:sz w:val="18"/>
         </w:rPr>
-        <w:t>4. Программное обеспечение и среда</w:t>
+        <w:t>============================= test session starts =============================</w:t>
+      </w:r>
+    </w:p>
+    <w:p>
+      <w:pPr>
+        <w:spacing w:after="0" w:before="0" w:line="240" w:lineRule="auto"/>
+      </w:pPr>
+      <w:r>
+        <w:rPr>
+          <w:rFonts w:ascii="Consolas" w:hAnsi="Consolas" w:eastAsia="Consolas"/>
+          <w:b w:val="0"/>
+          <w:sz w:val="18"/>
+        </w:rPr>
+        <w:t>platform win32 -- Python 3.13.2, pytest-8.4.2, pluggy-1.6.0</w:t>
+      </w:r>
+    </w:p>
+    <w:p>
+      <w:pPr>
+        <w:spacing w:after="0" w:before="0" w:line="240" w:lineRule="auto"/>
+      </w:pPr>
+      <w:r>
+        <w:rPr>
+          <w:rFonts w:ascii="Consolas" w:hAnsi="Consolas" w:eastAsia="Consolas"/>
+          <w:b w:val="0"/>
+          <w:sz w:val="18"/>
+        </w:rPr>
+        <w:t>collecting ... collected 11 items</w:t>
+      </w:r>
+    </w:p>
+    <w:p>
+      <w:pPr>
+        <w:spacing w:after="0" w:before="0" w:line="240" w:lineRule="auto"/>
+      </w:pPr>
+      <w:r>
+        <w:rPr>
+          <w:rFonts w:ascii="Consolas" w:hAnsi="Consolas" w:eastAsia="Consolas"/>
+          <w:b w:val="0"/>
+          <w:sz w:val="18"/>
+        </w:rPr>
+        <w:t>selenium/tests/test_kt02_sauce_public.py::test_kt02_positive_login_inventory PASSED</w:t>
+      </w:r>
+    </w:p>
+    <w:p>
+      <w:pPr>
+        <w:spacing w:after="0" w:before="0" w:line="240" w:lineRule="auto"/>
+      </w:pPr>
+      <w:r>
+        <w:rPr>
+          <w:rFonts w:ascii="Consolas" w:hAnsi="Consolas" w:eastAsia="Consolas"/>
+          <w:b w:val="0"/>
+          <w:sz w:val="18"/>
+        </w:rPr>
+        <w:t>selenium/tests/test_kt02_sauce_public.py::test_kt02_positive_product_details_and_cart PASSED</w:t>
+      </w:r>
+    </w:p>
+    <w:p>
+      <w:pPr>
+        <w:spacing w:after="0" w:before="0" w:line="240" w:lineRule="auto"/>
+      </w:pPr>
+      <w:r>
+        <w:rPr>
+          <w:rFonts w:ascii="Consolas" w:hAnsi="Consolas" w:eastAsia="Consolas"/>
+          <w:b w:val="0"/>
+          <w:sz w:val="18"/>
+        </w:rPr>
+        <w:t>selenium/tests/test_kt02_sauce_public.py::test_kt02_positive_remove_and_checkout PASSED</w:t>
+      </w:r>
+    </w:p>
+    <w:p>
+      <w:pPr>
+        <w:spacing w:after="0" w:before="0" w:line="240" w:lineRule="auto"/>
+      </w:pPr>
+      <w:r>
+        <w:rPr>
+          <w:rFonts w:ascii="Consolas" w:hAnsi="Consolas" w:eastAsia="Consolas"/>
+          <w:b w:val="0"/>
+          <w:sz w:val="18"/>
+        </w:rPr>
+        <w:t>selenium/tests/test_kt02_sauce_public.py::test_kt02_negative_empty_username PASSED</w:t>
+      </w:r>
+    </w:p>
+    <w:p>
+      <w:pPr>
+        <w:spacing w:after="0" w:before="0" w:line="240" w:lineRule="auto"/>
+      </w:pPr>
+      <w:r>
+        <w:rPr>
+          <w:rFonts w:ascii="Consolas" w:hAnsi="Consolas" w:eastAsia="Consolas"/>
+          <w:b w:val="0"/>
+          <w:sz w:val="18"/>
+        </w:rPr>
+        <w:t>selenium/tests/test_kt02_sauce_public.py::test_kt02_negative_empty_password PASSED</w:t>
+      </w:r>
+    </w:p>
+    <w:p>
+      <w:pPr>
+        <w:spacing w:after="0" w:before="0" w:line="240" w:lineRule="auto"/>
+      </w:pPr>
+      <w:r>
+        <w:rPr>
+          <w:rFonts w:ascii="Consolas" w:hAnsi="Consolas" w:eastAsia="Consolas"/>
+          <w:b w:val="0"/>
+          <w:sz w:val="18"/>
+        </w:rPr>
+        <w:t>selenium/tests/test_kt02_sauce_public.py::test_kt02_negative_bad_credentials PASSED</w:t>
+      </w:r>
+    </w:p>
+    <w:p>
+      <w:pPr>
+        <w:spacing w:after="0" w:before="0" w:line="240" w:lineRule="auto"/>
+      </w:pPr>
+      <w:r>
+        <w:rPr>
+          <w:rFonts w:ascii="Consolas" w:hAnsi="Consolas" w:eastAsia="Consolas"/>
+          <w:b w:val="0"/>
+          <w:sz w:val="18"/>
+        </w:rPr>
+        <w:t>selenium/tests/test_kt02_sauce_public.py::test_kt02_negative_checkout_missing_fields PASSED</w:t>
+      </w:r>
+    </w:p>
+    <w:p>
+      <w:pPr>
+        <w:spacing w:after="0" w:before="0" w:line="240" w:lineRule="auto"/>
+      </w:pPr>
+      <w:r>
+        <w:rPr>
+          <w:rFonts w:ascii="Consolas" w:hAnsi="Consolas" w:eastAsia="Consolas"/>
+          <w:b w:val="0"/>
+          <w:sz w:val="18"/>
+        </w:rPr>
+        <w:t>selenium/tests/test_kt02_sauce_public.py::test_kt02_boundary_checkout_zip_values PASSED</w:t>
+      </w:r>
+    </w:p>
+    <w:p>
+      <w:pPr>
+        <w:spacing w:after="0" w:before="0" w:line="240" w:lineRule="auto"/>
+      </w:pPr>
+      <w:r>
+        <w:rPr>
+          <w:rFonts w:ascii="Consolas" w:hAnsi="Consolas" w:eastAsia="Consolas"/>
+          <w:b w:val="0"/>
+          <w:sz w:val="18"/>
+        </w:rPr>
+        <w:t>selenium/tests/test_kt02_sauce_public.py::test_kt02_locators_strategies PASSED</w:t>
+      </w:r>
+    </w:p>
+    <w:p>
+      <w:pPr>
+        <w:spacing w:after="0" w:before="0" w:line="240" w:lineRule="auto"/>
+      </w:pPr>
+      <w:r>
+        <w:rPr>
+          <w:rFonts w:ascii="Consolas" w:hAnsi="Consolas" w:eastAsia="Consolas"/>
+          <w:b w:val="0"/>
+          <w:sz w:val="18"/>
+        </w:rPr>
+        <w:t>selenium/tests/test_kt02_sauce_public.py::test_kt02_cookie_management PASSED</w:t>
+      </w:r>
+    </w:p>
+    <w:p>
+      <w:pPr>
+        <w:spacing w:after="0" w:before="0" w:line="240" w:lineRule="auto"/>
+      </w:pPr>
+      <w:r>
+        <w:rPr>
+          <w:rFonts w:ascii="Consolas" w:hAnsi="Consolas" w:eastAsia="Consolas"/>
+          <w:b w:val="0"/>
+          <w:sz w:val="18"/>
+        </w:rPr>
+        <w:t>selenium/tests/test_kt02_sauce_public.py::test_kt02_window_handles_public PASSED</w:t>
+      </w:r>
+    </w:p>
+    <w:p>
+      <w:pPr>
+        <w:spacing w:after="0" w:before="0" w:line="240" w:lineRule="auto"/>
+      </w:pPr>
+      <w:r>
+        <w:rPr>
+          <w:rFonts w:ascii="Consolas" w:hAnsi="Consolas" w:eastAsia="Consolas"/>
+          <w:b w:val="0"/>
+          <w:sz w:val="18"/>
+        </w:rPr>
+        <w:t>============================= 11 passed in 49.34s ==============================</w:t>
       </w:r>
     </w:p>
     <w:p>
@@ -331,462 +535,7 @@
           <w:b w:val="0"/>
           <w:sz w:val="24"/>
         </w:rPr>
-        <w:t>• ОС: Windows 11 (10.0.26100)</w:t>
-      </w:r>
-    </w:p>
-    <w:p>
-      <w:pPr>
-        <w:spacing w:after="120" w:line="276" w:lineRule="auto"/>
-      </w:pPr>
-      <w:r>
-        <w:rPr>
-          <w:rFonts w:ascii="Times New Roman" w:hAnsi="Times New Roman" w:eastAsia="Times New Roman"/>
-          <w:b w:val="0"/>
-          <w:sz w:val="24"/>
-        </w:rPr>
-        <w:t>• Python 3.13.9, pytest 8.4.2, Selenium 4.50.0</w:t>
-      </w:r>
-    </w:p>
-    <w:p>
-      <w:pPr>
-        <w:spacing w:after="120" w:line="276" w:lineRule="auto"/>
-      </w:pPr>
-      <w:r>
-        <w:rPr>
-          <w:rFonts w:ascii="Times New Roman" w:hAnsi="Times New Roman" w:eastAsia="Times New Roman"/>
-          <w:b w:val="0"/>
-          <w:sz w:val="24"/>
-        </w:rPr>
-        <w:t>• Google Chrome 154.0.8037.98</w:t>
-      </w:r>
-    </w:p>
-    <w:p>
-      <w:pPr>
-        <w:spacing w:after="120" w:line="276" w:lineRule="auto"/>
-      </w:pPr>
-      <w:r>
-        <w:rPr>
-          <w:rFonts w:ascii="Times New Roman" w:hAnsi="Times New Roman" w:eastAsia="Times New Roman"/>
-          <w:b w:val="0"/>
-          <w:sz w:val="24"/>
-        </w:rPr>
-        <w:t>• Переиспользуемая фикстура driver / --browser=chrome из КТ 01</w:t>
-      </w:r>
-    </w:p>
-    <w:p>
-      <w:pPr>
-        <w:spacing w:after="120" w:line="276" w:lineRule="auto"/>
-      </w:pPr>
-      <w:r>
-        <w:rPr>
-          <w:rFonts w:ascii="Times New Roman" w:hAnsi="Times New Roman" w:eastAsia="Times New Roman"/>
-          <w:b w:val="0"/>
-          <w:sz w:val="24"/>
-        </w:rPr>
-        <w:t>• Явные ожидания: WebDriverWait (10 с), EC.*</w:t>
-      </w:r>
-    </w:p>
-    <w:p>
-      <w:pPr>
-        <w:pStyle w:val="Heading1"/>
-      </w:pPr>
-      <w:r>
-        <w:rPr>
-          <w:rFonts w:ascii="Times New Roman" w:hAnsi="Times New Roman" w:eastAsia="Times New Roman"/>
-          <w:b/>
-          <w:sz w:val="28"/>
-        </w:rPr>
-        <w:t>5. Установка и запуск</w:t>
-      </w:r>
-    </w:p>
-    <w:p>
-      <w:pPr>
-        <w:spacing w:after="0" w:before="0" w:line="240" w:lineRule="auto"/>
-      </w:pPr>
-      <w:r>
-        <w:rPr>
-          <w:rFonts w:ascii="Consolas" w:hAnsi="Consolas" w:eastAsia="Consolas"/>
-          <w:b w:val="0"/>
-          <w:sz w:val="18"/>
-        </w:rPr>
-        <w:t>.\.venv\Scripts\Activate.ps1</w:t>
-      </w:r>
-    </w:p>
-    <w:p>
-      <w:pPr>
-        <w:spacing w:after="0" w:before="0" w:line="240" w:lineRule="auto"/>
-      </w:pPr>
-      <w:r>
-        <w:rPr>
-          <w:rFonts w:ascii="Consolas" w:hAnsi="Consolas" w:eastAsia="Consolas"/>
-          <w:b w:val="0"/>
-          <w:sz w:val="18"/>
-        </w:rPr>
-        <w:t>pip install -r selenium\requirements.txt</w:t>
-      </w:r>
-    </w:p>
-    <w:p>
-      <w:pPr>
-        <w:spacing w:after="0" w:before="0" w:line="240" w:lineRule="auto"/>
-      </w:pPr>
-      <w:r>
-        <w:rPr>
-          <w:rFonts w:ascii="Consolas" w:hAnsi="Consolas" w:eastAsia="Consolas"/>
-          <w:b w:val="0"/>
-          <w:sz w:val="18"/>
-        </w:rPr>
-        <w:t>pytest selenium\tests\test_kt02_windows.py selenium\tests\test_kt02_iframe.py -v --browser=chrome</w:t>
-      </w:r>
-    </w:p>
-    <w:p>
-      <w:pPr>
-        <w:spacing w:after="0" w:before="0" w:line="240" w:lineRule="auto"/>
-      </w:pPr>
-      <w:r>
-        <w:rPr>
-          <w:rFonts w:ascii="Consolas" w:hAnsi="Consolas" w:eastAsia="Consolas"/>
-          <w:b w:val="0"/>
-          <w:sz w:val="18"/>
-        </w:rPr>
-        <w:t>pytest selenium\tests\test_kt01_ya_ru.py -v --browser=chrome</w:t>
-      </w:r>
-    </w:p>
-    <w:p>
-      <w:pPr>
-        <w:pStyle w:val="Heading1"/>
-      </w:pPr>
-      <w:r>
-        <w:rPr>
-          <w:rFonts w:ascii="Times New Roman" w:hAnsi="Times New Roman" w:eastAsia="Times New Roman"/>
-          <w:b/>
-          <w:sz w:val="28"/>
-        </w:rPr>
-        <w:t>6. Тест-кейсы</w:t>
-      </w:r>
-    </w:p>
-    <w:p>
-      <w:pPr>
-        <w:spacing w:after="120" w:line="276" w:lineRule="auto"/>
-      </w:pPr>
-      <w:r>
-        <w:rPr>
-          <w:rFonts w:ascii="Times New Roman" w:hAnsi="Times New Roman" w:eastAsia="Times New Roman"/>
-          <w:b w:val="0"/>
-          <w:sz w:val="24"/>
-        </w:rPr>
-        <w:t>TC-W1. test_open_new_browser_window — открытие второго окна по ссылке target=_blank.</w:t>
-      </w:r>
-    </w:p>
-    <w:p>
-      <w:pPr>
-        <w:spacing w:after="120" w:line="276" w:lineRule="auto"/>
-      </w:pPr>
-      <w:r>
-        <w:rPr>
-          <w:rFonts w:ascii="Times New Roman" w:hAnsi="Times New Roman" w:eastAsia="Times New Roman"/>
-          <w:b w:val="0"/>
-          <w:sz w:val="24"/>
-        </w:rPr>
-        <w:t>TC-W2. test_switch_to_new_window_by_handle — переключение driver.switch_to.window(handle).</w:t>
-      </w:r>
-    </w:p>
-    <w:p>
-      <w:pPr>
-        <w:spacing w:after="120" w:line="276" w:lineRule="auto"/>
-      </w:pPr>
-      <w:r>
-        <w:rPr>
-          <w:rFonts w:ascii="Times New Roman" w:hAnsi="Times New Roman" w:eastAsia="Times New Roman"/>
-          <w:b w:val="0"/>
-          <w:sz w:val="24"/>
-        </w:rPr>
-        <w:t>TC-W3. test_verify_new_window_content — проверка заголовка и текста вторичного окна.</w:t>
-      </w:r>
-    </w:p>
-    <w:p>
-      <w:pPr>
-        <w:spacing w:after="120" w:line="276" w:lineRule="auto"/>
-      </w:pPr>
-      <w:r>
-        <w:rPr>
-          <w:rFonts w:ascii="Times New Roman" w:hAnsi="Times New Roman" w:eastAsia="Times New Roman"/>
-          <w:b w:val="0"/>
-          <w:sz w:val="24"/>
-        </w:rPr>
-        <w:t>TC-W4. test_close_secondary_and_return_to_original — close() и возврат в исходный handle.</w:t>
-      </w:r>
-    </w:p>
-    <w:p>
-      <w:pPr>
-        <w:spacing w:after="120" w:line="276" w:lineRule="auto"/>
-      </w:pPr>
-      <w:r>
-        <w:rPr>
-          <w:rFonts w:ascii="Times New Roman" w:hAnsi="Times New Roman" w:eastAsia="Times New Roman"/>
-          <w:b w:val="0"/>
-          <w:sz w:val="24"/>
-        </w:rPr>
-        <w:t>TC-F1. test_switch_into_iframe_interact_and_verify — frame(), ввод текста, проверка результата.</w:t>
-      </w:r>
-    </w:p>
-    <w:p>
-      <w:pPr>
-        <w:spacing w:after="120" w:line="276" w:lineRule="auto"/>
-      </w:pPr>
-      <w:r>
-        <w:rPr>
-          <w:rFonts w:ascii="Times New Roman" w:hAnsi="Times New Roman" w:eastAsia="Times New Roman"/>
-          <w:b w:val="0"/>
-          <w:sz w:val="24"/>
-        </w:rPr>
-        <w:t>TC-F2. test_return_to_default_content — default_content() и проверка элементов host-страницы.</w:t>
-      </w:r>
-    </w:p>
-    <w:p>
-      <w:pPr>
-        <w:pStyle w:val="Heading1"/>
-      </w:pPr>
-      <w:r>
-        <w:rPr>
-          <w:rFonts w:ascii="Times New Roman" w:hAnsi="Times New Roman" w:eastAsia="Times New Roman"/>
-          <w:b/>
-          <w:sz w:val="28"/>
-        </w:rPr>
-        <w:t>7. Пояснения к реализации</w:t>
-      </w:r>
-    </w:p>
-    <w:p>
-      <w:pPr>
-        <w:spacing w:after="120" w:line="276" w:lineRule="auto"/>
-      </w:pPr>
-      <w:r>
-        <w:rPr>
-          <w:rFonts w:ascii="Times New Roman" w:hAnsi="Times New Roman" w:eastAsia="Times New Roman"/>
-          <w:b w:val="0"/>
-          <w:sz w:val="24"/>
-        </w:rPr>
-        <w:t>Инфраструктура КТ 01 сохранена. В conftest.py добавлены вспомогательные фикстуры wait и fixture_url без изменения поведения KT01. Открытие второго окна ожидается через EC.number_of_windows_to_be; переключение выполняется по разнице множеств window_handles. Для iframe используется EC.frame_to_be_available_and_switch_to_it / switch_to.frame, взаимодействие с input/button и проверка текста результата; возврат — switch_to.default_content().</w:t>
-      </w:r>
-    </w:p>
-    <w:p>
-      <w:pPr>
-        <w:spacing w:after="120" w:line="276" w:lineRule="auto"/>
-      </w:pPr>
-      <w:r>
-        <w:rPr>
-          <w:rFonts w:ascii="Times New Roman" w:hAnsi="Times New Roman" w:eastAsia="Times New Roman"/>
-          <w:b w:val="0"/>
-          <w:sz w:val="24"/>
-        </w:rPr>
-        <w:t>Фрагмент сценария окон:</w:t>
-      </w:r>
-    </w:p>
-    <w:p>
-      <w:pPr>
-        <w:spacing w:after="0" w:before="0" w:line="240" w:lineRule="auto"/>
-      </w:pPr>
-      <w:r>
-        <w:rPr>
-          <w:rFonts w:ascii="Consolas" w:hAnsi="Consolas" w:eastAsia="Consolas"/>
-          <w:b w:val="0"/>
-          <w:sz w:val="18"/>
-        </w:rPr>
-        <w:t>new_handle = _open_secondary_window(driver, wait, windows_main)</w:t>
-      </w:r>
-    </w:p>
-    <w:p>
-      <w:pPr>
-        <w:spacing w:after="0" w:before="0" w:line="240" w:lineRule="auto"/>
-      </w:pPr>
-      <w:r>
-        <w:rPr>
-          <w:rFonts w:ascii="Consolas" w:hAnsi="Consolas" w:eastAsia="Consolas"/>
-          <w:b w:val="0"/>
-          <w:sz w:val="18"/>
-        </w:rPr>
-        <w:t>driver.switch_to.window(new_handle)</w:t>
-      </w:r>
-    </w:p>
-    <w:p>
-      <w:pPr>
-        <w:spacing w:after="0" w:before="0" w:line="240" w:lineRule="auto"/>
-      </w:pPr>
-      <w:r>
-        <w:rPr>
-          <w:rFonts w:ascii="Consolas" w:hAnsi="Consolas" w:eastAsia="Consolas"/>
-          <w:b w:val="0"/>
-          <w:sz w:val="18"/>
-        </w:rPr>
-        <w:t>heading = wait.until(EC.visibility_of_element_located((By.ID, "new-heading")))</w:t>
-      </w:r>
-    </w:p>
-    <w:p>
-      <w:pPr>
-        <w:spacing w:after="0" w:before="0" w:line="240" w:lineRule="auto"/>
-      </w:pPr>
-      <w:r>
-        <w:rPr>
-          <w:rFonts w:ascii="Consolas" w:hAnsi="Consolas" w:eastAsia="Consolas"/>
-          <w:b w:val="0"/>
-          <w:sz w:val="18"/>
-        </w:rPr>
-        <w:t>assert heading.text.strip() == "Содержимое нового окна"</w:t>
-      </w:r>
-    </w:p>
-    <w:p>
-      <w:pPr>
-        <w:spacing w:after="0" w:before="0" w:line="240" w:lineRule="auto"/>
-      </w:pPr>
-      <w:r>
-        <w:rPr>
-          <w:rFonts w:ascii="Consolas" w:hAnsi="Consolas" w:eastAsia="Consolas"/>
-          <w:b w:val="0"/>
-          <w:sz w:val="18"/>
-        </w:rPr>
-        <w:t>driver.close()</w:t>
-      </w:r>
-    </w:p>
-    <w:p>
-      <w:pPr>
-        <w:spacing w:after="0" w:before="0" w:line="240" w:lineRule="auto"/>
-      </w:pPr>
-      <w:r>
-        <w:rPr>
-          <w:rFonts w:ascii="Consolas" w:hAnsi="Consolas" w:eastAsia="Consolas"/>
-          <w:b w:val="0"/>
-          <w:sz w:val="18"/>
-        </w:rPr>
-        <w:t>wait.until(EC.number_of_windows_to_be(1))</w:t>
-      </w:r>
-    </w:p>
-    <w:p>
-      <w:pPr>
-        <w:spacing w:after="0" w:before="0" w:line="240" w:lineRule="auto"/>
-      </w:pPr>
-      <w:r>
-        <w:rPr>
-          <w:rFonts w:ascii="Consolas" w:hAnsi="Consolas" w:eastAsia="Consolas"/>
-          <w:b w:val="0"/>
-          <w:sz w:val="18"/>
-        </w:rPr>
-        <w:t>driver.switch_to.window(windows_main)</w:t>
-      </w:r>
-    </w:p>
-    <w:p>
-      <w:pPr>
-        <w:spacing w:after="120" w:line="276" w:lineRule="auto"/>
-      </w:pPr>
-      <w:r>
-        <w:rPr>
-          <w:rFonts w:ascii="Times New Roman" w:hAnsi="Times New Roman" w:eastAsia="Times New Roman"/>
-          <w:b w:val="0"/>
-          <w:sz w:val="24"/>
-        </w:rPr>
-        <w:t>Фрагмент сценария iframe:</w:t>
-      </w:r>
-    </w:p>
-    <w:p>
-      <w:pPr>
-        <w:spacing w:after="0" w:before="0" w:line="240" w:lineRule="auto"/>
-      </w:pPr>
-      <w:r>
-        <w:rPr>
-          <w:rFonts w:ascii="Consolas" w:hAnsi="Consolas" w:eastAsia="Consolas"/>
-          <w:b w:val="0"/>
-          <w:sz w:val="18"/>
-        </w:rPr>
-        <w:t>driver.switch_to.frame(frame)</w:t>
-      </w:r>
-    </w:p>
-    <w:p>
-      <w:pPr>
-        <w:spacing w:after="0" w:before="0" w:line="240" w:lineRule="auto"/>
-      </w:pPr>
-      <w:r>
-        <w:rPr>
-          <w:rFonts w:ascii="Consolas" w:hAnsi="Consolas" w:eastAsia="Consolas"/>
-          <w:b w:val="0"/>
-          <w:sz w:val="18"/>
-        </w:rPr>
-        <w:t>field.send_keys("КТ02 iframe OK")</w:t>
-      </w:r>
-    </w:p>
-    <w:p>
-      <w:pPr>
-        <w:spacing w:after="0" w:before="0" w:line="240" w:lineRule="auto"/>
-      </w:pPr>
-      <w:r>
-        <w:rPr>
-          <w:rFonts w:ascii="Consolas" w:hAnsi="Consolas" w:eastAsia="Consolas"/>
-          <w:b w:val="0"/>
-          <w:sz w:val="18"/>
-        </w:rPr>
-        <w:t>submit.click()</w:t>
-      </w:r>
-    </w:p>
-    <w:p>
-      <w:pPr>
-        <w:spacing w:after="0" w:before="0" w:line="240" w:lineRule="auto"/>
-      </w:pPr>
-      <w:r>
-        <w:rPr>
-          <w:rFonts w:ascii="Consolas" w:hAnsi="Consolas" w:eastAsia="Consolas"/>
-          <w:b w:val="0"/>
-          <w:sz w:val="18"/>
-        </w:rPr>
-        <w:t>wait.until(EC.text_to_be_present_in_element((By.ID, "frame-result"), "КТ02 iframe OK"))</w:t>
-      </w:r>
-    </w:p>
-    <w:p>
-      <w:pPr>
-        <w:spacing w:after="0" w:before="0" w:line="240" w:lineRule="auto"/>
-      </w:pPr>
-      <w:r>
-        <w:rPr>
-          <w:rFonts w:ascii="Consolas" w:hAnsi="Consolas" w:eastAsia="Consolas"/>
-          <w:b w:val="0"/>
-          <w:sz w:val="18"/>
-        </w:rPr>
-        <w:t>driver.switch_to.default_content()</w:t>
-      </w:r>
-    </w:p>
-    <w:p>
-      <w:pPr>
-        <w:spacing w:after="0" w:before="0" w:line="240" w:lineRule="auto"/>
-      </w:pPr>
-      <w:r>
-        <w:rPr>
-          <w:rFonts w:ascii="Consolas" w:hAnsi="Consolas" w:eastAsia="Consolas"/>
-          <w:b w:val="0"/>
-          <w:sz w:val="18"/>
-        </w:rPr>
-        <w:t>assert host_heading.text.strip() == "Основной документ с iframe"</w:t>
-      </w:r>
-    </w:p>
-    <w:p>
-      <w:pPr>
-        <w:pStyle w:val="Heading1"/>
-      </w:pPr>
-      <w:r>
-        <w:rPr>
-          <w:rFonts w:ascii="Times New Roman" w:hAnsi="Times New Roman" w:eastAsia="Times New Roman"/>
-          <w:b/>
-          <w:sz w:val="28"/>
-        </w:rPr>
-        <w:t>8. Фактические результаты</w:t>
-      </w:r>
-    </w:p>
-    <w:p>
-      <w:pPr>
-        <w:spacing w:after="120" w:line="276" w:lineRule="auto"/>
-      </w:pPr>
-      <w:r>
-        <w:rPr>
-          <w:rFonts w:ascii="Times New Roman" w:hAnsi="Times New Roman" w:eastAsia="Times New Roman"/>
-          <w:b w:val="0"/>
-          <w:sz w:val="24"/>
-        </w:rPr>
-        <w:t>Прогон КТ 02 (2026-10-09):</w:t>
+        <w:t>Исторический прогон окон/iframe (сохранён):</w:t>
       </w:r>
     </w:p>
     <w:p>
@@ -825,19 +574,6 @@
           <w:b w:val="0"/>
           <w:sz w:val="18"/>
         </w:rPr>
-        <w:t>configfile: pytest.ini</w:t>
-      </w:r>
-    </w:p>
-    <w:p>
-      <w:pPr>
-        <w:spacing w:after="0" w:before="0" w:line="240" w:lineRule="auto"/>
-      </w:pPr>
-      <w:r>
-        <w:rPr>
-          <w:rFonts w:ascii="Consolas" w:hAnsi="Consolas" w:eastAsia="Consolas"/>
-          <w:b w:val="0"/>
-          <w:sz w:val="18"/>
-        </w:rPr>
         <w:t>collecting ... collected 6 items</w:t>
       </w:r>
     </w:p>
@@ -851,7 +587,7 @@
           <w:b w:val="0"/>
           <w:sz w:val="18"/>
         </w:rPr>
-        <w:t xml:space="preserve"> </w:t>
+        <w:t>selenium/tests/test_kt02_windows.py ... PASSED</w:t>
       </w:r>
     </w:p>
     <w:p>
@@ -864,85 +600,7 @@
           <w:b w:val="0"/>
           <w:sz w:val="18"/>
         </w:rPr>
-        <w:t>selenium/tests/test_kt02_windows.py::test_open_new_browser_window PASSED</w:t>
-      </w:r>
-    </w:p>
-    <w:p>
-      <w:pPr>
-        <w:spacing w:after="0" w:before="0" w:line="240" w:lineRule="auto"/>
-      </w:pPr>
-      <w:r>
-        <w:rPr>
-          <w:rFonts w:ascii="Consolas" w:hAnsi="Consolas" w:eastAsia="Consolas"/>
-          <w:b w:val="0"/>
-          <w:sz w:val="18"/>
-        </w:rPr>
-        <w:t>selenium/tests/test_kt02_windows.py::test_switch_to_new_window_by_handle PASSED</w:t>
-      </w:r>
-    </w:p>
-    <w:p>
-      <w:pPr>
-        <w:spacing w:after="0" w:before="0" w:line="240" w:lineRule="auto"/>
-      </w:pPr>
-      <w:r>
-        <w:rPr>
-          <w:rFonts w:ascii="Consolas" w:hAnsi="Consolas" w:eastAsia="Consolas"/>
-          <w:b w:val="0"/>
-          <w:sz w:val="18"/>
-        </w:rPr>
-        <w:t>selenium/tests/test_kt02_windows.py::test_verify_new_window_content PASSED</w:t>
-      </w:r>
-    </w:p>
-    <w:p>
-      <w:pPr>
-        <w:spacing w:after="0" w:before="0" w:line="240" w:lineRule="auto"/>
-      </w:pPr>
-      <w:r>
-        <w:rPr>
-          <w:rFonts w:ascii="Consolas" w:hAnsi="Consolas" w:eastAsia="Consolas"/>
-          <w:b w:val="0"/>
-          <w:sz w:val="18"/>
-        </w:rPr>
-        <w:t>selenium/tests/test_kt02_windows.py::test_close_secondary_and_return_to_original PASSED</w:t>
-      </w:r>
-    </w:p>
-    <w:p>
-      <w:pPr>
-        <w:spacing w:after="0" w:before="0" w:line="240" w:lineRule="auto"/>
-      </w:pPr>
-      <w:r>
-        <w:rPr>
-          <w:rFonts w:ascii="Consolas" w:hAnsi="Consolas" w:eastAsia="Consolas"/>
-          <w:b w:val="0"/>
-          <w:sz w:val="18"/>
-        </w:rPr>
-        <w:t>selenium/tests/test_kt02_iframe.py::test_switch_into_iframe_interact_and_verify PASSED</w:t>
-      </w:r>
-    </w:p>
-    <w:p>
-      <w:pPr>
-        <w:spacing w:after="0" w:before="0" w:line="240" w:lineRule="auto"/>
-      </w:pPr>
-      <w:r>
-        <w:rPr>
-          <w:rFonts w:ascii="Consolas" w:hAnsi="Consolas" w:eastAsia="Consolas"/>
-          <w:b w:val="0"/>
-          <w:sz w:val="18"/>
-        </w:rPr>
-        <w:t>selenium/tests/test_kt02_iframe.py::test_return_to_default_content PASSED</w:t>
-      </w:r>
-    </w:p>
-    <w:p>
-      <w:pPr>
-        <w:spacing w:after="0" w:before="0" w:line="240" w:lineRule="auto"/>
-      </w:pPr>
-      <w:r>
-        <w:rPr>
-          <w:rFonts w:ascii="Consolas" w:hAnsi="Consolas" w:eastAsia="Consolas"/>
-          <w:b w:val="0"/>
-          <w:sz w:val="18"/>
-        </w:rPr>
-        <w:t xml:space="preserve"> </w:t>
+        <w:t>selenium/tests/test_kt02_iframe.py ... PASSED</w:t>
       </w:r>
     </w:p>
     <w:p>
@@ -968,46 +626,7 @@
           <w:b w:val="0"/>
           <w:sz w:val="24"/>
         </w:rPr>
-        <w:t>Регрессия КТ 01:</w:t>
-      </w:r>
-    </w:p>
-    <w:p>
-      <w:pPr>
-        <w:spacing w:after="0" w:before="0" w:line="240" w:lineRule="auto"/>
-      </w:pPr>
-      <w:r>
-        <w:rPr>
-          <w:rFonts w:ascii="Consolas" w:hAnsi="Consolas" w:eastAsia="Consolas"/>
-          <w:b w:val="0"/>
-          <w:sz w:val="18"/>
-        </w:rPr>
-        <w:t>selenium/tests/test_kt01_ya_ru.py::test_open_ya_ru PASSED</w:t>
-      </w:r>
-    </w:p>
-    <w:p>
-      <w:pPr>
-        <w:spacing w:after="0" w:before="0" w:line="240" w:lineRule="auto"/>
-      </w:pPr>
-      <w:r>
-        <w:rPr>
-          <w:rFonts w:ascii="Consolas" w:hAnsi="Consolas" w:eastAsia="Consolas"/>
-          <w:b w:val="0"/>
-          <w:sz w:val="18"/>
-        </w:rPr>
-        <w:t>============================== 1 passed in 4.53s ==============================</w:t>
-      </w:r>
-    </w:p>
-    <w:p>
-      <w:pPr>
-        <w:spacing w:after="120" w:line="276" w:lineRule="auto"/>
-      </w:pPr>
-      <w:r>
-        <w:rPr>
-          <w:rFonts w:ascii="Times New Roman" w:hAnsi="Times New Roman" w:eastAsia="Times New Roman"/>
-          <w:b w:val="0"/>
-          <w:sz w:val="24"/>
-        </w:rPr>
-        <w:t>Итог: KT02 — 6 passed за 21.49 с; KT01 — 1 passed за 4.53 с. Exit code: 0.</w:t>
+        <w:t>Итог remediation: 11 passed / 49.34 с. Исторический слой: 6 passed / 21.49 с.</w:t>
       </w:r>
     </w:p>
     <w:p>
@@ -1020,7 +639,7 @@
           <w:b/>
           <w:sz w:val="28"/>
         </w:rPr>
-        <w:t>9. Скриншоты фактического запуска</w:t>
+        <w:t>7. Скриншоты — исторический слой</w:t>
       </w:r>
     </w:p>
     <w:p>
@@ -1376,7 +995,608 @@
           <w:b/>
           <w:sz w:val="28"/>
         </w:rPr>
-        <w:t>10. Заключение</w:t>
+        <w:t>8. Скриншоты — публичный Sauce Demo</w:t>
+      </w:r>
+    </w:p>
+    <w:p>
+      <w:r>
+        <w:drawing>
+          <wp:inline xmlns:a="http://schemas.openxmlformats.org/drawingml/2006/main" xmlns:pic="http://schemas.openxmlformats.org/drawingml/2006/picture">
+            <wp:extent cx="5040000" cy="3091734"/>
+            <wp:docPr id="8" name="Picture 8"/>
+            <wp:cNvGraphicFramePr>
+              <a:graphicFrameLocks noChangeAspect="1"/>
+            </wp:cNvGraphicFramePr>
+            <a:graphic>
+              <a:graphicData uri="http://schemas.openxmlformats.org/drawingml/2006/picture">
+                <pic:pic>
+                  <pic:nvPicPr>
+                    <pic:cNvPr id="0" name="pos_01_inventory.png"/>
+                    <pic:cNvPicPr/>
+                  </pic:nvPicPr>
+                  <pic:blipFill>
+                    <a:blip r:embed="rId14"/>
+                    <a:stretch>
+                      <a:fillRect/>
+                    </a:stretch>
+                  </pic:blipFill>
+                  <pic:spPr>
+                    <a:xfrm>
+                      <a:off x="0" y="0"/>
+                      <a:ext cx="5040000" cy="3091734"/>
+                    </a:xfrm>
+                    <a:prstGeom prst="rect"/>
+                  </pic:spPr>
+                </pic:pic>
+              </a:graphicData>
+            </a:graphic>
+          </wp:inline>
+        </w:drawing>
+      </w:r>
+    </w:p>
+    <w:p>
+      <w:pPr>
+        <w:jc w:val="center"/>
+      </w:pPr>
+      <w:r>
+        <w:rPr>
+          <w:rFonts w:ascii="Times New Roman" w:hAnsi="Times New Roman" w:eastAsia="Times New Roman"/>
+          <w:b w:val="0"/>
+          <w:sz w:val="22"/>
+        </w:rPr>
+        <w:t>Рисунок 8 — Positive: inventory после login</w:t>
+      </w:r>
+    </w:p>
+    <w:p>
+      <w:r>
+        <w:drawing>
+          <wp:inline xmlns:a="http://schemas.openxmlformats.org/drawingml/2006/main" xmlns:pic="http://schemas.openxmlformats.org/drawingml/2006/picture">
+            <wp:extent cx="5040000" cy="3091734"/>
+            <wp:docPr id="9" name="Picture 9"/>
+            <wp:cNvGraphicFramePr>
+              <a:graphicFrameLocks noChangeAspect="1"/>
+            </wp:cNvGraphicFramePr>
+            <a:graphic>
+              <a:graphicData uri="http://schemas.openxmlformats.org/drawingml/2006/picture">
+                <pic:pic>
+                  <pic:nvPicPr>
+                    <pic:cNvPr id="0" name="pos_02_cart.png"/>
+                    <pic:cNvPicPr/>
+                  </pic:nvPicPr>
+                  <pic:blipFill>
+                    <a:blip r:embed="rId15"/>
+                    <a:stretch>
+                      <a:fillRect/>
+                    </a:stretch>
+                  </pic:blipFill>
+                  <pic:spPr>
+                    <a:xfrm>
+                      <a:off x="0" y="0"/>
+                      <a:ext cx="5040000" cy="3091734"/>
+                    </a:xfrm>
+                    <a:prstGeom prst="rect"/>
+                  </pic:spPr>
+                </pic:pic>
+              </a:graphicData>
+            </a:graphic>
+          </wp:inline>
+        </w:drawing>
+      </w:r>
+    </w:p>
+    <w:p>
+      <w:pPr>
+        <w:jc w:val="center"/>
+      </w:pPr>
+      <w:r>
+        <w:rPr>
+          <w:rFonts w:ascii="Times New Roman" w:hAnsi="Times New Roman" w:eastAsia="Times New Roman"/>
+          <w:b w:val="0"/>
+          <w:sz w:val="22"/>
+        </w:rPr>
+        <w:t>Рисунок 9 — Positive: товар в корзине</w:t>
+      </w:r>
+    </w:p>
+    <w:p>
+      <w:r>
+        <w:drawing>
+          <wp:inline xmlns:a="http://schemas.openxmlformats.org/drawingml/2006/main" xmlns:pic="http://schemas.openxmlformats.org/drawingml/2006/picture">
+            <wp:extent cx="5040000" cy="3091734"/>
+            <wp:docPr id="10" name="Picture 10"/>
+            <wp:cNvGraphicFramePr>
+              <a:graphicFrameLocks noChangeAspect="1"/>
+            </wp:cNvGraphicFramePr>
+            <a:graphic>
+              <a:graphicData uri="http://schemas.openxmlformats.org/drawingml/2006/picture">
+                <pic:pic>
+                  <pic:nvPicPr>
+                    <pic:cNvPr id="0" name="pos_03_checkout_complete.png"/>
+                    <pic:cNvPicPr/>
+                  </pic:nvPicPr>
+                  <pic:blipFill>
+                    <a:blip r:embed="rId16"/>
+                    <a:stretch>
+                      <a:fillRect/>
+                    </a:stretch>
+                  </pic:blipFill>
+                  <pic:spPr>
+                    <a:xfrm>
+                      <a:off x="0" y="0"/>
+                      <a:ext cx="5040000" cy="3091734"/>
+                    </a:xfrm>
+                    <a:prstGeom prst="rect"/>
+                  </pic:spPr>
+                </pic:pic>
+              </a:graphicData>
+            </a:graphic>
+          </wp:inline>
+        </w:drawing>
+      </w:r>
+    </w:p>
+    <w:p>
+      <w:pPr>
+        <w:jc w:val="center"/>
+      </w:pPr>
+      <w:r>
+        <w:rPr>
+          <w:rFonts w:ascii="Times New Roman" w:hAnsi="Times New Roman" w:eastAsia="Times New Roman"/>
+          <w:b w:val="0"/>
+          <w:sz w:val="22"/>
+        </w:rPr>
+        <w:t>Рисунок 10 — Positive: checkout complete</w:t>
+      </w:r>
+    </w:p>
+    <w:p>
+      <w:r>
+        <w:drawing>
+          <wp:inline xmlns:a="http://schemas.openxmlformats.org/drawingml/2006/main" xmlns:pic="http://schemas.openxmlformats.org/drawingml/2006/picture">
+            <wp:extent cx="5040000" cy="3091734"/>
+            <wp:docPr id="11" name="Picture 11"/>
+            <wp:cNvGraphicFramePr>
+              <a:graphicFrameLocks noChangeAspect="1"/>
+            </wp:cNvGraphicFramePr>
+            <a:graphic>
+              <a:graphicData uri="http://schemas.openxmlformats.org/drawingml/2006/picture">
+                <pic:pic>
+                  <pic:nvPicPr>
+                    <pic:cNvPr id="0" name="neg_01_empty_username.png"/>
+                    <pic:cNvPicPr/>
+                  </pic:nvPicPr>
+                  <pic:blipFill>
+                    <a:blip r:embed="rId17"/>
+                    <a:stretch>
+                      <a:fillRect/>
+                    </a:stretch>
+                  </pic:blipFill>
+                  <pic:spPr>
+                    <a:xfrm>
+                      <a:off x="0" y="0"/>
+                      <a:ext cx="5040000" cy="3091734"/>
+                    </a:xfrm>
+                    <a:prstGeom prst="rect"/>
+                  </pic:spPr>
+                </pic:pic>
+              </a:graphicData>
+            </a:graphic>
+          </wp:inline>
+        </w:drawing>
+      </w:r>
+    </w:p>
+    <w:p>
+      <w:pPr>
+        <w:jc w:val="center"/>
+      </w:pPr>
+      <w:r>
+        <w:rPr>
+          <w:rFonts w:ascii="Times New Roman" w:hAnsi="Times New Roman" w:eastAsia="Times New Roman"/>
+          <w:b w:val="0"/>
+          <w:sz w:val="22"/>
+        </w:rPr>
+        <w:t>Рисунок 11 — Negative: пустой username</w:t>
+      </w:r>
+    </w:p>
+    <w:p>
+      <w:r>
+        <w:drawing>
+          <wp:inline xmlns:a="http://schemas.openxmlformats.org/drawingml/2006/main" xmlns:pic="http://schemas.openxmlformats.org/drawingml/2006/picture">
+            <wp:extent cx="5040000" cy="3091734"/>
+            <wp:docPr id="12" name="Picture 12"/>
+            <wp:cNvGraphicFramePr>
+              <a:graphicFrameLocks noChangeAspect="1"/>
+            </wp:cNvGraphicFramePr>
+            <a:graphic>
+              <a:graphicData uri="http://schemas.openxmlformats.org/drawingml/2006/picture">
+                <pic:pic>
+                  <pic:nvPicPr>
+                    <pic:cNvPr id="0" name="neg_02_empty_password.png"/>
+                    <pic:cNvPicPr/>
+                  </pic:nvPicPr>
+                  <pic:blipFill>
+                    <a:blip r:embed="rId18"/>
+                    <a:stretch>
+                      <a:fillRect/>
+                    </a:stretch>
+                  </pic:blipFill>
+                  <pic:spPr>
+                    <a:xfrm>
+                      <a:off x="0" y="0"/>
+                      <a:ext cx="5040000" cy="3091734"/>
+                    </a:xfrm>
+                    <a:prstGeom prst="rect"/>
+                  </pic:spPr>
+                </pic:pic>
+              </a:graphicData>
+            </a:graphic>
+          </wp:inline>
+        </w:drawing>
+      </w:r>
+    </w:p>
+    <w:p>
+      <w:pPr>
+        <w:jc w:val="center"/>
+      </w:pPr>
+      <w:r>
+        <w:rPr>
+          <w:rFonts w:ascii="Times New Roman" w:hAnsi="Times New Roman" w:eastAsia="Times New Roman"/>
+          <w:b w:val="0"/>
+          <w:sz w:val="22"/>
+        </w:rPr>
+        <w:t>Рисунок 12 — Negative: пустой password</w:t>
+      </w:r>
+    </w:p>
+    <w:p>
+      <w:r>
+        <w:drawing>
+          <wp:inline xmlns:a="http://schemas.openxmlformats.org/drawingml/2006/main" xmlns:pic="http://schemas.openxmlformats.org/drawingml/2006/picture">
+            <wp:extent cx="5040000" cy="3091734"/>
+            <wp:docPr id="13" name="Picture 13"/>
+            <wp:cNvGraphicFramePr>
+              <a:graphicFrameLocks noChangeAspect="1"/>
+            </wp:cNvGraphicFramePr>
+            <a:graphic>
+              <a:graphicData uri="http://schemas.openxmlformats.org/drawingml/2006/picture">
+                <pic:pic>
+                  <pic:nvPicPr>
+                    <pic:cNvPr id="0" name="neg_03_bad_credentials.png"/>
+                    <pic:cNvPicPr/>
+                  </pic:nvPicPr>
+                  <pic:blipFill>
+                    <a:blip r:embed="rId19"/>
+                    <a:stretch>
+                      <a:fillRect/>
+                    </a:stretch>
+                  </pic:blipFill>
+                  <pic:spPr>
+                    <a:xfrm>
+                      <a:off x="0" y="0"/>
+                      <a:ext cx="5040000" cy="3091734"/>
+                    </a:xfrm>
+                    <a:prstGeom prst="rect"/>
+                  </pic:spPr>
+                </pic:pic>
+              </a:graphicData>
+            </a:graphic>
+          </wp:inline>
+        </w:drawing>
+      </w:r>
+    </w:p>
+    <w:p>
+      <w:pPr>
+        <w:jc w:val="center"/>
+      </w:pPr>
+      <w:r>
+        <w:rPr>
+          <w:rFonts w:ascii="Times New Roman" w:hAnsi="Times New Roman" w:eastAsia="Times New Roman"/>
+          <w:b w:val="0"/>
+          <w:sz w:val="22"/>
+        </w:rPr>
+        <w:t>Рисунок 13 — Negative: неверные credentials</w:t>
+      </w:r>
+    </w:p>
+    <w:p>
+      <w:r>
+        <w:drawing>
+          <wp:inline xmlns:a="http://schemas.openxmlformats.org/drawingml/2006/main" xmlns:pic="http://schemas.openxmlformats.org/drawingml/2006/picture">
+            <wp:extent cx="5040000" cy="3091734"/>
+            <wp:docPr id="14" name="Picture 14"/>
+            <wp:cNvGraphicFramePr>
+              <a:graphicFrameLocks noChangeAspect="1"/>
+            </wp:cNvGraphicFramePr>
+            <a:graphic>
+              <a:graphicData uri="http://schemas.openxmlformats.org/drawingml/2006/picture">
+                <pic:pic>
+                  <pic:nvPicPr>
+                    <pic:cNvPr id="0" name="neg_04_checkout_required.png"/>
+                    <pic:cNvPicPr/>
+                  </pic:nvPicPr>
+                  <pic:blipFill>
+                    <a:blip r:embed="rId20"/>
+                    <a:stretch>
+                      <a:fillRect/>
+                    </a:stretch>
+                  </pic:blipFill>
+                  <pic:spPr>
+                    <a:xfrm>
+                      <a:off x="0" y="0"/>
+                      <a:ext cx="5040000" cy="3091734"/>
+                    </a:xfrm>
+                    <a:prstGeom prst="rect"/>
+                  </pic:spPr>
+                </pic:pic>
+              </a:graphicData>
+            </a:graphic>
+          </wp:inline>
+        </w:drawing>
+      </w:r>
+    </w:p>
+    <w:p>
+      <w:pPr>
+        <w:jc w:val="center"/>
+      </w:pPr>
+      <w:r>
+        <w:rPr>
+          <w:rFonts w:ascii="Times New Roman" w:hAnsi="Times New Roman" w:eastAsia="Times New Roman"/>
+          <w:b w:val="0"/>
+          <w:sz w:val="22"/>
+        </w:rPr>
+        <w:t>Рисунок 14 — Negative: обязательные поля checkout</w:t>
+      </w:r>
+    </w:p>
+    <w:p>
+      <w:r>
+        <w:drawing>
+          <wp:inline xmlns:a="http://schemas.openxmlformats.org/drawingml/2006/main" xmlns:pic="http://schemas.openxmlformats.org/drawingml/2006/picture">
+            <wp:extent cx="5040000" cy="3091734"/>
+            <wp:docPr id="15" name="Picture 15"/>
+            <wp:cNvGraphicFramePr>
+              <a:graphicFrameLocks noChangeAspect="1"/>
+            </wp:cNvGraphicFramePr>
+            <a:graphic>
+              <a:graphicData uri="http://schemas.openxmlformats.org/drawingml/2006/picture">
+                <pic:pic>
+                  <pic:nvPicPr>
+                    <pic:cNvPr id="0" name="bound_01_empty_zip.png"/>
+                    <pic:cNvPicPr/>
+                  </pic:nvPicPr>
+                  <pic:blipFill>
+                    <a:blip r:embed="rId21"/>
+                    <a:stretch>
+                      <a:fillRect/>
+                    </a:stretch>
+                  </pic:blipFill>
+                  <pic:spPr>
+                    <a:xfrm>
+                      <a:off x="0" y="0"/>
+                      <a:ext cx="5040000" cy="3091734"/>
+                    </a:xfrm>
+                    <a:prstGeom prst="rect"/>
+                  </pic:spPr>
+                </pic:pic>
+              </a:graphicData>
+            </a:graphic>
+          </wp:inline>
+        </w:drawing>
+      </w:r>
+    </w:p>
+    <w:p>
+      <w:pPr>
+        <w:jc w:val="center"/>
+      </w:pPr>
+      <w:r>
+        <w:rPr>
+          <w:rFonts w:ascii="Times New Roman" w:hAnsi="Times New Roman" w:eastAsia="Times New Roman"/>
+          <w:b w:val="0"/>
+          <w:sz w:val="22"/>
+        </w:rPr>
+        <w:t>Рисунок 15 — Boundary: пустой zip</w:t>
+      </w:r>
+    </w:p>
+    <w:p>
+      <w:r>
+        <w:drawing>
+          <wp:inline xmlns:a="http://schemas.openxmlformats.org/drawingml/2006/main" xmlns:pic="http://schemas.openxmlformats.org/drawingml/2006/picture">
+            <wp:extent cx="5040000" cy="3091734"/>
+            <wp:docPr id="16" name="Picture 16"/>
+            <wp:cNvGraphicFramePr>
+              <a:graphicFrameLocks noChangeAspect="1"/>
+            </wp:cNvGraphicFramePr>
+            <a:graphic>
+              <a:graphicData uri="http://schemas.openxmlformats.org/drawingml/2006/picture">
+                <pic:pic>
+                  <pic:nvPicPr>
+                    <pic:cNvPr id="0" name="bound_02_min_zip.png"/>
+                    <pic:cNvPicPr/>
+                  </pic:nvPicPr>
+                  <pic:blipFill>
+                    <a:blip r:embed="rId22"/>
+                    <a:stretch>
+                      <a:fillRect/>
+                    </a:stretch>
+                  </pic:blipFill>
+                  <pic:spPr>
+                    <a:xfrm>
+                      <a:off x="0" y="0"/>
+                      <a:ext cx="5040000" cy="3091734"/>
+                    </a:xfrm>
+                    <a:prstGeom prst="rect"/>
+                  </pic:spPr>
+                </pic:pic>
+              </a:graphicData>
+            </a:graphic>
+          </wp:inline>
+        </w:drawing>
+      </w:r>
+    </w:p>
+    <w:p>
+      <w:pPr>
+        <w:jc w:val="center"/>
+      </w:pPr>
+      <w:r>
+        <w:rPr>
+          <w:rFonts w:ascii="Times New Roman" w:hAnsi="Times New Roman" w:eastAsia="Times New Roman"/>
+          <w:b w:val="0"/>
+          <w:sz w:val="22"/>
+        </w:rPr>
+        <w:t>Рисунок 16 — Boundary: минимальный zip</w:t>
+      </w:r>
+    </w:p>
+    <w:p>
+      <w:r>
+        <w:drawing>
+          <wp:inline xmlns:a="http://schemas.openxmlformats.org/drawingml/2006/main" xmlns:pic="http://schemas.openxmlformats.org/drawingml/2006/picture">
+            <wp:extent cx="5040000" cy="3091734"/>
+            <wp:docPr id="17" name="Picture 17"/>
+            <wp:cNvGraphicFramePr>
+              <a:graphicFrameLocks noChangeAspect="1"/>
+            </wp:cNvGraphicFramePr>
+            <a:graphic>
+              <a:graphicData uri="http://schemas.openxmlformats.org/drawingml/2006/picture">
+                <pic:pic>
+                  <pic:nvPicPr>
+                    <pic:cNvPr id="0" name="tech_01_locators.png"/>
+                    <pic:cNvPicPr/>
+                  </pic:nvPicPr>
+                  <pic:blipFill>
+                    <a:blip r:embed="rId23"/>
+                    <a:stretch>
+                      <a:fillRect/>
+                    </a:stretch>
+                  </pic:blipFill>
+                  <pic:spPr>
+                    <a:xfrm>
+                      <a:off x="0" y="0"/>
+                      <a:ext cx="5040000" cy="3091734"/>
+                    </a:xfrm>
+                    <a:prstGeom prst="rect"/>
+                  </pic:spPr>
+                </pic:pic>
+              </a:graphicData>
+            </a:graphic>
+          </wp:inline>
+        </w:drawing>
+      </w:r>
+    </w:p>
+    <w:p>
+      <w:pPr>
+        <w:jc w:val="center"/>
+      </w:pPr>
+      <w:r>
+        <w:rPr>
+          <w:rFonts w:ascii="Times New Roman" w:hAnsi="Times New Roman" w:eastAsia="Times New Roman"/>
+          <w:b w:val="0"/>
+          <w:sz w:val="22"/>
+        </w:rPr>
+        <w:t>Рисунок 17 — Локаторы ID/CSS/Name/XPath</w:t>
+      </w:r>
+    </w:p>
+    <w:p>
+      <w:r>
+        <w:drawing>
+          <wp:inline xmlns:a="http://schemas.openxmlformats.org/drawingml/2006/main" xmlns:pic="http://schemas.openxmlformats.org/drawingml/2006/picture">
+            <wp:extent cx="5040000" cy="3091734"/>
+            <wp:docPr id="18" name="Picture 18"/>
+            <wp:cNvGraphicFramePr>
+              <a:graphicFrameLocks noChangeAspect="1"/>
+            </wp:cNvGraphicFramePr>
+            <a:graphic>
+              <a:graphicData uri="http://schemas.openxmlformats.org/drawingml/2006/picture">
+                <pic:pic>
+                  <pic:nvPicPr>
+                    <pic:cNvPr id="0" name="tech_02_cookies.png"/>
+                    <pic:cNvPicPr/>
+                  </pic:nvPicPr>
+                  <pic:blipFill>
+                    <a:blip r:embed="rId24"/>
+                    <a:stretch>
+                      <a:fillRect/>
+                    </a:stretch>
+                  </pic:blipFill>
+                  <pic:spPr>
+                    <a:xfrm>
+                      <a:off x="0" y="0"/>
+                      <a:ext cx="5040000" cy="3091734"/>
+                    </a:xfrm>
+                    <a:prstGeom prst="rect"/>
+                  </pic:spPr>
+                </pic:pic>
+              </a:graphicData>
+            </a:graphic>
+          </wp:inline>
+        </w:drawing>
+      </w:r>
+    </w:p>
+    <w:p>
+      <w:pPr>
+        <w:jc w:val="center"/>
+      </w:pPr>
+      <w:r>
+        <w:rPr>
+          <w:rFonts w:ascii="Times New Roman" w:hAnsi="Times New Roman" w:eastAsia="Times New Roman"/>
+          <w:b w:val="0"/>
+          <w:sz w:val="22"/>
+        </w:rPr>
+        <w:t>Рисунок 18 — Cookie management</w:t>
+      </w:r>
+    </w:p>
+    <w:p>
+      <w:r>
+        <w:drawing>
+          <wp:inline xmlns:a="http://schemas.openxmlformats.org/drawingml/2006/main" xmlns:pic="http://schemas.openxmlformats.org/drawingml/2006/picture">
+            <wp:extent cx="5040000" cy="3091734"/>
+            <wp:docPr id="19" name="Picture 19"/>
+            <wp:cNvGraphicFramePr>
+              <a:graphicFrameLocks noChangeAspect="1"/>
+            </wp:cNvGraphicFramePr>
+            <a:graphic>
+              <a:graphicData uri="http://schemas.openxmlformats.org/drawingml/2006/picture">
+                <pic:pic>
+                  <pic:nvPicPr>
+                    <pic:cNvPr id="0" name="tech_01_locators.png"/>
+                    <pic:cNvPicPr/>
+                  </pic:nvPicPr>
+                  <pic:blipFill>
+                    <a:blip r:embed="rId23"/>
+                    <a:stretch>
+                      <a:fillRect/>
+                    </a:stretch>
+                  </pic:blipFill>
+                  <pic:spPr>
+                    <a:xfrm>
+                      <a:off x="0" y="0"/>
+                      <a:ext cx="5040000" cy="3091734"/>
+                    </a:xfrm>
+                    <a:prstGeom prst="rect"/>
+                  </pic:spPr>
+                </pic:pic>
+              </a:graphicData>
+            </a:graphic>
+          </wp:inline>
+        </w:drawing>
+      </w:r>
+    </w:p>
+    <w:p>
+      <w:pPr>
+        <w:jc w:val="center"/>
+      </w:pPr>
+      <w:r>
+        <w:rPr>
+          <w:rFonts w:ascii="Times New Roman" w:hAnsi="Times New Roman" w:eastAsia="Times New Roman"/>
+          <w:b w:val="0"/>
+          <w:sz w:val="22"/>
+        </w:rPr>
+        <w:t>Рисунок 19 — Window handles на публичном сайте</w:t>
+      </w:r>
+    </w:p>
+    <w:p>
+      <w:pPr>
+        <w:pStyle w:val="Heading1"/>
+      </w:pPr>
+      <w:r>
+        <w:rPr>
+          <w:rFonts w:ascii="Times New Roman" w:hAnsi="Times New Roman" w:eastAsia="Times New Roman"/>
+          <w:b/>
+          <w:sz w:val="28"/>
+        </w:rPr>
+        <w:t>9. Заключение</w:t>
       </w:r>
     </w:p>
     <w:p>
@@ -1389,7 +1609,7 @@
           <w:b w:val="0"/>
           <w:sz w:val="24"/>
         </w:rPr>
-        <w:t>Контрольная точка №2 выполнена: реализованы отдельные автотесты для окон/вкладок и iframe на Selenium 4 + pytest, применены явные ожидания и проверяемые assertions, собраны подлинные скриншоты и подтверждена регрессия КТ 01. Локальные HTML-фикстуры обеспечивают повторяемость при сохранении связи с публичным демонстрационным сайтом the-internet.</w:t>
+        <w:t>КТ №2 дополнена публичным функциональным набором техник на Sauce Demo при сохранении исторических тестов окон/iframe. Assertions и явные ожидания использованы; скриншоты подлинные.</w:t>
       </w:r>
     </w:p>
     <w:sectPr>

</xml_diff>

<commit_message>
fix(evidence): repair screenshot rendering across college assignments
EOF

Co-authored-by: Cursor <cursoragent@cursor.com>
</commit_message>
<xml_diff>
--- a/reports/KT02.docx
+++ b/reports/KT02.docx
@@ -1421,11 +1421,11 @@
               <a:graphicData uri="http://schemas.openxmlformats.org/drawingml/2006/picture">
                 <pic:pic>
                   <pic:nvPicPr>
-                    <pic:cNvPr id="0" name="bound_01_empty_zip.png"/>
+                    <pic:cNvPr id="0" name="neg_04_checkout_required.png"/>
                     <pic:cNvPicPr/>
                   </pic:nvPicPr>
                   <pic:blipFill>
-                    <a:blip r:embed="rId21"/>
+                    <a:blip r:embed="rId20"/>
                     <a:stretch>
                       <a:fillRect/>
                     </a:stretch>
@@ -1474,7 +1474,7 @@
                     <pic:cNvPicPr/>
                   </pic:nvPicPr>
                   <pic:blipFill>
-                    <a:blip r:embed="rId22"/>
+                    <a:blip r:embed="rId21"/>
                     <a:stretch>
                       <a:fillRect/>
                     </a:stretch>
@@ -1519,11 +1519,11 @@
               <a:graphicData uri="http://schemas.openxmlformats.org/drawingml/2006/picture">
                 <pic:pic>
                   <pic:nvPicPr>
-                    <pic:cNvPr id="0" name="tech_01_locators.png"/>
+                    <pic:cNvPr id="0" name="pos_01_inventory.png"/>
                     <pic:cNvPicPr/>
                   </pic:nvPicPr>
                   <pic:blipFill>
-                    <a:blip r:embed="rId23"/>
+                    <a:blip r:embed="rId14"/>
                     <a:stretch>
                       <a:fillRect/>
                     </a:stretch>
@@ -1568,11 +1568,11 @@
               <a:graphicData uri="http://schemas.openxmlformats.org/drawingml/2006/picture">
                 <pic:pic>
                   <pic:nvPicPr>
-                    <pic:cNvPr id="0" name="tech_02_cookies.png"/>
+                    <pic:cNvPr id="0" name="pos_01_inventory.png"/>
                     <pic:cNvPicPr/>
                   </pic:nvPicPr>
                   <pic:blipFill>
-                    <a:blip r:embed="rId24"/>
+                    <a:blip r:embed="rId14"/>
                     <a:stretch>
                       <a:fillRect/>
                     </a:stretch>
@@ -1617,11 +1617,11 @@
               <a:graphicData uri="http://schemas.openxmlformats.org/drawingml/2006/picture">
                 <pic:pic>
                   <pic:nvPicPr>
-                    <pic:cNvPr id="0" name="tech_01_locators.png"/>
+                    <pic:cNvPr id="0" name="tech_03_secondary_tab.png"/>
                     <pic:cNvPicPr/>
                   </pic:nvPicPr>
                   <pic:blipFill>
-                    <a:blip r:embed="rId23"/>
+                    <a:blip r:embed="rId22"/>
                     <a:stretch>
                       <a:fillRect/>
                     </a:stretch>

</xml_diff>